<commit_message>
Updated figures and reviewer checklist.
</commit_message>
<xml_diff>
--- a/Documentation/Reports and Papers/Isometric_Force_Test/Review_round_1/Reviewer_checklist.docx
+++ b/Documentation/Reports and Papers/Isometric_Force_Test/Review_round_1/Reviewer_checklist.docx
@@ -42,6 +42,9 @@
       <w:r>
         <w:t>For clarification, are you asking for a figure legend?</w:t>
       </w:r>
+      <w:r>
+        <w:t xml:space="preserve"> Figure has been updated.</w:t>
+      </w:r>
     </w:p>
     <w:p>
       <w:pPr>
@@ -63,13 +66,24 @@
           <w:numId w:val="1"/>
         </w:numPr>
       </w:pPr>
+      <w:r>
+        <w:t xml:space="preserve">The size of Figures 2 through 4 </w:t>
+      </w:r>
       <w:proofErr w:type="gramStart"/>
       <w:r>
-        <w:t>Agreed</w:t>
+        <w:t>have</w:t>
       </w:r>
       <w:proofErr w:type="gramEnd"/>
       <w:r>
-        <w:t>. Will fix.</w:t>
+        <w:t xml:space="preserve"> </w:t>
+      </w:r>
+      <w:proofErr w:type="gramStart"/>
+      <w:r>
+        <w:t>been increased</w:t>
+      </w:r>
+      <w:proofErr w:type="gramEnd"/>
+      <w:r>
+        <w:t>.</w:t>
       </w:r>
     </w:p>
     <w:p>
@@ -133,7 +147,10 @@
         </w:numPr>
       </w:pPr>
       <w:r>
-        <w:t>Ok, we will add.</w:t>
+        <w:t xml:space="preserve">Ok, </w:t>
+      </w:r>
+      <w:r>
+        <w:t>the last two paragraphs have been organized under a Conclusion section.</w:t>
       </w:r>
     </w:p>
     <w:p>
@@ -208,7 +225,29 @@
         <w:t xml:space="preserve"> </w:t>
       </w:r>
       <w:r>
-        <w:t>The Festo Fluidic Muscle DMSP (2026) manual mention to avoid an unpressurized state and leave a residual pressure of up to 0.5 bar, and therefore the passive stiffness at this pressure would also be considered.</w:t>
+        <w:t xml:space="preserve">The Festo Fluidic Muscle DMSP (2026) manual </w:t>
+      </w:r>
+      <w:proofErr w:type="gramStart"/>
+      <w:r>
+        <w:t>mention</w:t>
+      </w:r>
+      <w:proofErr w:type="gramEnd"/>
+      <w:r>
+        <w:t xml:space="preserve"> to avoid </w:t>
+      </w:r>
+      <w:proofErr w:type="gramStart"/>
+      <w:r>
+        <w:t>an unpressurized</w:t>
+      </w:r>
+      <w:proofErr w:type="gramEnd"/>
+      <w:r>
+        <w:t xml:space="preserve"> state and leave a residual pressure of up to 0.5 bar, and therefore the passive stiffness at this pressure </w:t>
+      </w:r>
+      <w:r>
+        <w:t>sh</w:t>
+      </w:r>
+      <w:r>
+        <w:t>ould also be considered.</w:t>
       </w:r>
     </w:p>
     <w:p>
@@ -235,7 +274,13 @@
         <w:t>Noted on our analysis of maximum strain. We do not have systematic… Normalizing helps account for manufacturing variations. Own paragraph or combine with point 5.</w:t>
       </w:r>
       <w:r>
-        <w:t xml:space="preserve"> Add error bars to 3(b)</w:t>
+        <w:t xml:space="preserve"> </w:t>
+      </w:r>
+      <w:r>
+        <w:rPr>
+          <w:color w:val="70AD47" w:themeColor="accent6"/>
+        </w:rPr>
+        <w:t>Add error bars to 3(b)</w:t>
       </w:r>
     </w:p>
     <w:p>
@@ -542,13 +587,22 @@
       </w:r>
       <w:r>
         <w:lastRenderedPageBreak/>
-        <w:t>vessel where end effects dominate: “</w:t>
+        <w:t xml:space="preserve">vessel where end effects dominate: </w:t>
       </w:r>
       <w:r>
         <w:tab/>
       </w:r>
       <w:r>
-        <w:t>Clamped ends that fix diameter but allow axial displacement: impose strong boundary conditions that force steep gradients in hoop strain near the ends → boundary layers where bending and shear matter and analytic membrane-only solutions deviate.</w:t>
+        <w:t>“</w:t>
+      </w:r>
+      <w:r>
+        <w:t>Clamped ends that fix diameter but allow axial displacement: impose str</w:t>
+      </w:r>
+      <w:r>
+        <w:t>o</w:t>
+      </w:r>
+      <w:r>
+        <w:t>ng boundary conditions that force steep gradients in hoop strain near the ends → boundary layers where bending and shear matter and analytic membrane-only solutions deviate.</w:t>
       </w:r>
     </w:p>
     <w:p>
@@ -621,9 +675,18 @@
           <w:ilvl w:val="1"/>
           <w:numId w:val="3"/>
         </w:numPr>
-      </w:pPr>
-      <w:r>
-        <w:t>i.e. find older references.</w:t>
+        <w:rPr>
+          <w:color w:val="EE0000"/>
+        </w:rPr>
+      </w:pPr>
+      <w:r>
+        <w:t xml:space="preserve">i.e. </w:t>
+      </w:r>
+      <w:r>
+        <w:rPr>
+          <w:color w:val="EE0000"/>
+        </w:rPr>
+        <w:t>find older references.</w:t>
       </w:r>
     </w:p>
     <w:p>
@@ -647,7 +710,7 @@
         </w:numPr>
       </w:pPr>
       <w:r>
-        <w:t>We will update.</w:t>
+        <w:t>We have updated these figures for ease of readability.</w:t>
       </w:r>
     </w:p>
     <w:p>
@@ -701,13 +764,28 @@
         </w:numPr>
       </w:pPr>
       <w:r>
-        <w:t>To address this, we will a</w:t>
-      </w:r>
-      <w:r>
+        <w:t xml:space="preserve">To address this, we will </w:t>
+      </w:r>
+      <w:r>
+        <w:rPr>
+          <w:color w:val="EE0000"/>
+        </w:rPr>
+        <w:t>a</w:t>
+      </w:r>
+      <w:r>
+        <w:rPr>
+          <w:color w:val="EE0000"/>
+        </w:rPr>
         <w:t>dd to discussion</w:t>
       </w:r>
       <w:r>
-        <w:t xml:space="preserve"> section the</w:t>
+        <w:rPr>
+          <w:color w:val="EE0000"/>
+        </w:rPr>
+        <w:t xml:space="preserve"> </w:t>
+      </w:r>
+      <w:r>
+        <w:t>section the</w:t>
       </w:r>
       <w:r>
         <w:t xml:space="preserve"> ways that BPAs are and are not like real muscles. </w:t>
@@ -1778,6 +1856,7 @@
   <w:style w:type="character" w:default="1" w:styleId="DefaultParagraphFont">
     <w:name w:val="Default Paragraph Font"/>
     <w:uiPriority w:val="1"/>
+    <w:semiHidden/>
     <w:unhideWhenUsed/>
   </w:style>
   <w:style w:type="table" w:default="1" w:styleId="TableNormal">

</xml_diff>

<commit_message>
Updating figures for readability
Figure 2a, 2b, 3a, 3b, and 4a. 4a needs slight work on marker size, including in the legend. Figure 4b needs to be updated.
</commit_message>
<xml_diff>
--- a/Documentation/Reports and Papers/Isometric_Force_Test/Review_round_1/Reviewer_checklist.docx
+++ b/Documentation/Reports and Papers/Isometric_Force_Test/Review_round_1/Reviewer_checklist.docx
@@ -76,7 +76,23 @@
         </w:numPr>
       </w:pPr>
       <w:r>
-        <w:t>The size of Figures 2 through 4 have been increased.</w:t>
+        <w:t xml:space="preserve">The size of Figures 2 through 4 </w:t>
+      </w:r>
+      <w:proofErr w:type="gramStart"/>
+      <w:r>
+        <w:t>have</w:t>
+      </w:r>
+      <w:proofErr w:type="gramEnd"/>
+      <w:r>
+        <w:t xml:space="preserve"> </w:t>
+      </w:r>
+      <w:proofErr w:type="gramStart"/>
+      <w:r>
+        <w:t>been increased</w:t>
+      </w:r>
+      <w:proofErr w:type="gramEnd"/>
+      <w:r>
+        <w:t>.</w:t>
       </w:r>
     </w:p>
     <w:p>
@@ -88,7 +104,15 @@
         </w:numPr>
       </w:pPr>
       <w:r>
-        <w:t>There should be a space between the value and the unit, such as, 490 N. Check and revise across this manuscript.</w:t>
+        <w:t xml:space="preserve">There should be a space between the value and the unit, such </w:t>
+      </w:r>
+      <w:proofErr w:type="gramStart"/>
+      <w:r>
+        <w:t>as,</w:t>
+      </w:r>
+      <w:proofErr w:type="gramEnd"/>
+      <w:r>
+        <w:t xml:space="preserve"> 490 N. Check and revise across this manuscript.</w:t>
       </w:r>
     </w:p>
     <w:p>
@@ -100,25 +124,57 @@
         </w:numPr>
       </w:pPr>
       <w:r>
-        <w:t xml:space="preserve">We’ve used package siunitx with the standard /, space. We checked </w:t>
-      </w:r>
-      <w:r>
-        <w:t>the document and corrected a few that had a simple space. We</w:t>
-      </w:r>
-      <w:r>
-        <w:t xml:space="preserve"> change </w:t>
-      </w:r>
-      <w:r>
-        <w:t xml:space="preserve">can change the default options to a larger space, </w:t>
-      </w:r>
-      <w:r>
-        <w:t>it if needed</w:t>
+        <w:t xml:space="preserve">We’ve used package </w:t>
+      </w:r>
+      <w:proofErr w:type="spellStart"/>
+      <w:r>
+        <w:t>siunitx</w:t>
+      </w:r>
+      <w:proofErr w:type="spellEnd"/>
+      <w:r>
+        <w:t xml:space="preserve"> with the standard /, space. We checked </w:t>
+      </w:r>
+      <w:r>
+        <w:t xml:space="preserve">the document and corrected a few that had a simple space. </w:t>
+      </w:r>
+      <w:proofErr w:type="gramStart"/>
+      <w:r>
+        <w:t>We</w:t>
+      </w:r>
+      <w:r>
+        <w:t xml:space="preserve"> change</w:t>
+      </w:r>
+      <w:proofErr w:type="gramEnd"/>
+      <w:r>
+        <w:t xml:space="preserve"> </w:t>
+      </w:r>
+      <w:r>
+        <w:t>can change the default options to a larger space</w:t>
+      </w:r>
+      <w:proofErr w:type="gramStart"/>
+      <w:r>
+        <w:t xml:space="preserve">, </w:t>
+      </w:r>
+      <w:r>
+        <w:t>it</w:t>
+      </w:r>
+      <w:proofErr w:type="gramEnd"/>
+      <w:r>
+        <w:t xml:space="preserve"> if needed</w:t>
       </w:r>
       <w:r>
         <w:t xml:space="preserve">, but </w:t>
       </w:r>
       <w:r>
-        <w:t>would need approval from MDPI copy-editors.</w:t>
+        <w:t xml:space="preserve">would need approval from MDPI </w:t>
+      </w:r>
+      <w:proofErr w:type="gramStart"/>
+      <w:r>
+        <w:t>copy-editors</w:t>
+      </w:r>
+      <w:proofErr w:type="gramEnd"/>
+      <w:r>
+        <w:t>.</w:t>
       </w:r>
     </w:p>
     <w:p>
@@ -184,7 +240,15 @@
         <w:t>We a</w:t>
       </w:r>
       <w:r>
-        <w:t xml:space="preserve">nticipate that these equations can but used for the other sizes (5mm and 40 mm), but data would need to be collected. </w:t>
+        <w:t>nticipate that these equations can but used for the other sizes (5</w:t>
+      </w:r>
+      <w:proofErr w:type="gramStart"/>
+      <w:r>
+        <w:t>mm</w:t>
+      </w:r>
+      <w:proofErr w:type="gramEnd"/>
+      <w:r>
+        <w:t xml:space="preserve"> and 40 mm), but data would need to be collected. </w:t>
       </w:r>
       <w:r>
         <w:t xml:space="preserve"> The shapes of the 5 mm and 40 mm BPAs are similar. If one considers coefficients c1 and c2 to be exponential shaping factors, and c0 to be the relative importance of the exponential decay, then the equations should fit the similar curves but with different coefficients.</w:t>
@@ -199,7 +263,23 @@
         </w:numPr>
       </w:pPr>
       <w:r>
-        <w:t>What is the stiffness of the Festo BPA when a zero pressure is applied? Characterization of such a passive stiffness is demanded.</w:t>
+        <w:t xml:space="preserve">What is the stiffness of the Festo BPA when </w:t>
+      </w:r>
+      <w:proofErr w:type="gramStart"/>
+      <w:r>
+        <w:t>a zero</w:t>
+      </w:r>
+      <w:proofErr w:type="gramEnd"/>
+      <w:r>
+        <w:t xml:space="preserve"> pressure is applied? Characterization of </w:t>
+      </w:r>
+      <w:proofErr w:type="gramStart"/>
+      <w:r>
+        <w:t>such a</w:t>
+      </w:r>
+      <w:proofErr w:type="gramEnd"/>
+      <w:r>
+        <w:t xml:space="preserve"> passive stiffness is demanded.</w:t>
       </w:r>
     </w:p>
     <w:p>
@@ -250,13 +330,21 @@
         <w:t xml:space="preserve">should </w:t>
       </w:r>
       <w:r>
-        <w:t xml:space="preserve">the passive stiffness at this pressure </w:t>
+        <w:t xml:space="preserve">the passive stiffness at this </w:t>
+      </w:r>
+      <w:proofErr w:type="gramStart"/>
+      <w:r>
+        <w:t xml:space="preserve">pressure </w:t>
       </w:r>
       <w:r>
         <w:t>sh</w:t>
       </w:r>
       <w:r>
-        <w:t>ould also be considered</w:t>
+        <w:t>ould</w:t>
+      </w:r>
+      <w:proofErr w:type="gramEnd"/>
+      <w:r>
+        <w:t xml:space="preserve"> also be considered</w:t>
       </w:r>
       <w:r>
         <w:t>?</w:t>
@@ -298,7 +386,23 @@
         <w:t>systemati</w:t>
       </w:r>
       <w:r>
-        <w:t xml:space="preserve">c analysis of the effects of manufacturing variations on BPA properties, but have noticed that seems to be more prominent in the 10 mm BPAs. </w:t>
+        <w:t xml:space="preserve">c analysis of the effects of manufacturing variations on BPA </w:t>
+      </w:r>
+      <w:proofErr w:type="gramStart"/>
+      <w:r>
+        <w:t>properties, but</w:t>
+      </w:r>
+      <w:proofErr w:type="gramEnd"/>
+      <w:r>
+        <w:t xml:space="preserve"> have noticed </w:t>
+      </w:r>
+      <w:proofErr w:type="gramStart"/>
+      <w:r>
+        <w:t>that</w:t>
+      </w:r>
+      <w:proofErr w:type="gramEnd"/>
+      <w:r>
+        <w:t xml:space="preserve"> seems to be more prominent in the 10 mm BPAs. </w:t>
       </w:r>
       <w:r>
         <w:t xml:space="preserve">Normalizing helps account for manufacturing variations. </w:t>
@@ -441,6 +545,9 @@
       <w:r>
         <w:t>Table 3 has been added to compare our model with that of Sarosi and Martens and Bolan.</w:t>
       </w:r>
+      <w:r>
+        <w:t xml:space="preserve"> Subsection Comparison with Existing BPA Models has been added to Discussion.</w:t>
+      </w:r>
     </w:p>
     <w:p>
       <w:pPr>
@@ -451,7 +558,15 @@
         </w:numPr>
       </w:pPr>
       <w:r>
-        <w:t>Why 620 kPa is chosen as the normalization reference? Whether other pressures can also be employed?</w:t>
+        <w:t xml:space="preserve">Why </w:t>
+      </w:r>
+      <w:proofErr w:type="gramStart"/>
+      <w:r>
+        <w:t>620 kPa is</w:t>
+      </w:r>
+      <w:proofErr w:type="gramEnd"/>
+      <w:r>
+        <w:t xml:space="preserve"> chosen as the normalization reference? Whether other pressures can also be employed?</w:t>
       </w:r>
     </w:p>
     <w:p>
@@ -523,7 +638,15 @@
         </w:numPr>
       </w:pPr>
       <w:r>
-        <w:t>Yes. Small equation. Can also be used in lookup table for quick real-time control.</w:t>
+        <w:t xml:space="preserve">Yes. Small equation. </w:t>
+      </w:r>
+      <w:proofErr w:type="gramStart"/>
+      <w:r>
+        <w:t>Can</w:t>
+      </w:r>
+      <w:proofErr w:type="gramEnd"/>
+      <w:r>
+        <w:t xml:space="preserve"> also be used in lookup table for quick real-time control.</w:t>
       </w:r>
     </w:p>
     <w:p>
@@ -710,7 +833,15 @@
         <w:t>The improved Hill-muscle model of Thelen [22] shows an exponential term for a muscle’s passive force-length property concentric loading.</w:t>
       </w:r>
       <w:r>
-        <w:t>"  This model is specifically for aging muscles.  In general the impact of the connective tissue on the curve is a step function.  Do the authors have a more general reference for this?</w:t>
+        <w:t xml:space="preserve">"  This model is specifically for aging muscles.  In </w:t>
+      </w:r>
+      <w:proofErr w:type="gramStart"/>
+      <w:r>
+        <w:t>general</w:t>
+      </w:r>
+      <w:proofErr w:type="gramEnd"/>
+      <w:r>
+        <w:t xml:space="preserve"> the impact of the connective tissue on the curve is a step function.  Do the authors have a more general reference for this?</w:t>
       </w:r>
     </w:p>
     <w:p>
@@ -725,22 +856,7 @@
         </w:rPr>
       </w:pPr>
       <w:r>
-        <w:t xml:space="preserve">i.e. </w:t>
-      </w:r>
-      <w:r>
-        <w:rPr>
-          <w:color w:val="EE0000"/>
-        </w:rPr>
-        <w:t>find older references.</w:t>
-      </w:r>
-      <w:r>
-        <w:rPr>
-          <w:color w:val="EE0000"/>
-        </w:rPr>
-        <w:t xml:space="preserve"> </w:t>
-      </w:r>
-      <w:r>
-        <w:t>This paragraph sort of trails off. Let’s update it clearly tie up ideas and transition to the next paragraph.</w:t>
+        <w:t>Added Biomimetic Artificial Muscle Analogy subsection to discussion mentioning the work of Winters and Chou and Hannaford.</w:t>
       </w:r>
     </w:p>
     <w:p>
@@ -776,7 +892,19 @@
         </w:numPr>
       </w:pPr>
       <w:r>
-        <w:t>An observation is that the disadvantage of BPAs are: "maximum tensile force occurs at resting (i.e., uninflated) length (l</w:t>
+        <w:t xml:space="preserve">An observation is that the disadvantage of BPAs </w:t>
+      </w:r>
+      <w:proofErr w:type="gramStart"/>
+      <w:r>
+        <w:t>are</w:t>
+      </w:r>
+      <w:proofErr w:type="gramEnd"/>
+      <w:r>
+        <w:t>: "maximum tensile force occurs at resting (i.e., uninflated) length (</w:t>
+      </w:r>
+      <w:proofErr w:type="spellStart"/>
+      <w:r>
+        <w:t>l</w:t>
       </w:r>
       <w:r>
         <w:rPr>
@@ -784,12 +912,21 @@
         </w:rPr>
         <w:t>rest</w:t>
       </w:r>
+      <w:proofErr w:type="spellEnd"/>
       <w:r>
         <w:t xml:space="preserve">) rather than at an optimal fiber length".  Is the ability of the natural musculoskeletal system to adapt to the required loads and ranges placed </w:t>
       </w:r>
       <w:r>
         <w:lastRenderedPageBreak/>
-        <w:t>upon them, by changing tenson length, sarcomere and fibre numbers, at least as significant problem when trying to mimic the natural system?</w:t>
+        <w:t xml:space="preserve">upon them, by changing tenson length, sarcomere and </w:t>
+      </w:r>
+      <w:proofErr w:type="spellStart"/>
+      <w:r>
+        <w:t>fibre</w:t>
+      </w:r>
+      <w:proofErr w:type="spellEnd"/>
+      <w:r>
+        <w:t xml:space="preserve"> numbers, at least as significant problem when trying to mimic the natural system?</w:t>
       </w:r>
     </w:p>
     <w:p>

</xml_diff>